<commit_message>
Update whitespace and documentation
</commit_message>
<xml_diff>
--- a/documentation/Install, Tune, & Run the Controller.docx
+++ b/documentation/Install, Tune, & Run the Controller.docx
@@ -3860,7 +3860,7 @@
           <w:noProof/>
         </w:rPr>
         <w:drawing>
-          <wp:anchor distT="0" distB="0" distL="114300" distR="114300" simplePos="0" relativeHeight="251719680" behindDoc="0" locked="0" layoutInCell="1" allowOverlap="1" wp14:anchorId="6B50EC5F" wp14:editId="41B41283">
+          <wp:anchor distT="0" distB="0" distL="114300" distR="114300" simplePos="0" relativeHeight="251719680" behindDoc="0" locked="0" layoutInCell="1" allowOverlap="1" wp14:anchorId="6B50EC5F" wp14:editId="6752422E">
             <wp:simplePos x="0" y="0"/>
             <wp:positionH relativeFrom="column">
               <wp:posOffset>1095375</wp:posOffset>
@@ -9663,6 +9663,222 @@
         <w:t xml:space="preserve"> </w:t>
       </w:r>
     </w:p>
+    <w:p/>
+    <w:p>
+      <w:r>
+        <w:br w:type="page"/>
+      </w:r>
+    </w:p>
+    <w:p>
+      <w:pPr>
+        <w:pStyle w:val="Heading1"/>
+      </w:pPr>
+      <w:r>
+        <w:lastRenderedPageBreak/>
+        <w:t>Controller architecture and operating principles</w:t>
+      </w:r>
+    </w:p>
+    <w:p/>
+    <w:p>
+      <w:pPr>
+        <w:pStyle w:val="ListParagraph"/>
+        <w:numPr>
+          <w:ilvl w:val="0"/>
+          <w:numId w:val="30"/>
+        </w:numPr>
+      </w:pPr>
+      <w:r>
+        <w:t>High-level: PID controller with anti-windup and clipping of control signal</w:t>
+      </w:r>
+    </w:p>
+    <w:p>
+      <w:pPr>
+        <w:pStyle w:val="ListParagraph"/>
+        <w:numPr>
+          <w:ilvl w:val="1"/>
+          <w:numId w:val="30"/>
+        </w:numPr>
+      </w:pPr>
+      <w:r>
+        <w:t>Measured and desired signal: pressure</w:t>
+      </w:r>
+    </w:p>
+    <w:p>
+      <w:pPr>
+        <w:pStyle w:val="ListParagraph"/>
+        <w:numPr>
+          <w:ilvl w:val="1"/>
+          <w:numId w:val="30"/>
+        </w:numPr>
+      </w:pPr>
+      <w:r>
+        <w:t>Commanded signal: duty cycle of two solenoid valves</w:t>
+      </w:r>
+    </w:p>
+    <w:p>
+      <w:pPr>
+        <w:pStyle w:val="ListParagraph"/>
+        <w:numPr>
+          <w:ilvl w:val="1"/>
+          <w:numId w:val="30"/>
+        </w:numPr>
+      </w:pPr>
+      <w:r>
+        <w:t>Controller will loop the programmed pressure trajectory infinitely until test fails or is manually stopped</w:t>
+      </w:r>
+    </w:p>
+    <w:p>
+      <w:pPr>
+        <w:pStyle w:val="ListParagraph"/>
+        <w:numPr>
+          <w:ilvl w:val="1"/>
+          <w:numId w:val="30"/>
+        </w:numPr>
+      </w:pPr>
+      <w:r>
+        <w:t>To avoid windup, controller resets between repeated cycles of the trajectory</w:t>
+      </w:r>
+    </w:p>
+    <w:p>
+      <w:pPr>
+        <w:pStyle w:val="ListParagraph"/>
+        <w:numPr>
+          <w:ilvl w:val="0"/>
+          <w:numId w:val="30"/>
+        </w:numPr>
+      </w:pPr>
+      <w:r>
+        <w:t>Startup protocol</w:t>
+      </w:r>
+    </w:p>
+    <w:p>
+      <w:pPr>
+        <w:pStyle w:val="ListParagraph"/>
+        <w:numPr>
+          <w:ilvl w:val="0"/>
+          <w:numId w:val="30"/>
+        </w:numPr>
+      </w:pPr>
+      <w:r>
+        <w:t>End-of-test logic: a test should automatically end when any of the following conditions are met</w:t>
+      </w:r>
+    </w:p>
+    <w:p>
+      <w:pPr>
+        <w:pStyle w:val="ListParagraph"/>
+        <w:numPr>
+          <w:ilvl w:val="1"/>
+          <w:numId w:val="30"/>
+        </w:numPr>
+      </w:pPr>
+      <w:r>
+        <w:t>Overpressure triggered</w:t>
+      </w:r>
+    </w:p>
+    <w:p>
+      <w:pPr>
+        <w:pStyle w:val="ListParagraph"/>
+        <w:numPr>
+          <w:ilvl w:val="2"/>
+          <w:numId w:val="30"/>
+        </w:numPr>
+      </w:pPr>
+      <w:r>
+        <w:t xml:space="preserve">If sensor reads above OVERPRESSURE_LIMIT, </w:t>
+      </w:r>
+      <w:r>
+        <w:t xml:space="preserve">vent and </w:t>
+      </w:r>
+      <w:r>
+        <w:t>end test</w:t>
+      </w:r>
+    </w:p>
+    <w:p>
+      <w:pPr>
+        <w:pStyle w:val="ListParagraph"/>
+        <w:numPr>
+          <w:ilvl w:val="2"/>
+          <w:numId w:val="30"/>
+        </w:numPr>
+      </w:pPr>
+      <w:r>
+        <w:t>Reason for test end: “Overpressure”</w:t>
+      </w:r>
+    </w:p>
+    <w:p>
+      <w:pPr>
+        <w:pStyle w:val="ListParagraph"/>
+        <w:numPr>
+          <w:ilvl w:val="1"/>
+          <w:numId w:val="30"/>
+        </w:numPr>
+      </w:pPr>
+      <w:r>
+        <w:t>Controller cannot follow programmed trajectory</w:t>
+      </w:r>
+    </w:p>
+    <w:p>
+      <w:pPr>
+        <w:pStyle w:val="ListParagraph"/>
+        <w:numPr>
+          <w:ilvl w:val="2"/>
+          <w:numId w:val="30"/>
+        </w:numPr>
+      </w:pPr>
+      <w:r>
+        <w:t>if (</w:t>
+      </w:r>
+      <w:proofErr w:type="spellStart"/>
+      <w:proofErr w:type="gramStart"/>
+      <w:r>
+        <w:t>traj.failingToFollow</w:t>
+      </w:r>
+      <w:proofErr w:type="spellEnd"/>
+      <w:proofErr w:type="gramEnd"/>
+      <w:r>
+        <w:t>(</w:t>
+      </w:r>
+      <w:proofErr w:type="spellStart"/>
+      <w:r>
+        <w:t>SensorPressure</w:t>
+      </w:r>
+      <w:proofErr w:type="spellEnd"/>
+      <w:r>
+        <w:t xml:space="preserve">, </w:t>
+      </w:r>
+      <w:proofErr w:type="spellStart"/>
+      <w:r>
+        <w:t>deltaT</w:t>
+      </w:r>
+      <w:proofErr w:type="spellEnd"/>
+      <w:r>
+        <w:t>, THRESHOLD)) {</w:t>
+      </w:r>
+      <w:r>
+        <w:t>}</w:t>
+      </w:r>
+    </w:p>
+    <w:p>
+      <w:pPr>
+        <w:pStyle w:val="ListParagraph"/>
+        <w:numPr>
+          <w:ilvl w:val="0"/>
+          <w:numId w:val="30"/>
+        </w:numPr>
+      </w:pPr>
+      <w:r>
+        <w:t>Data logging</w:t>
+      </w:r>
+    </w:p>
+    <w:p>
+      <w:pPr>
+        <w:pStyle w:val="ListParagraph"/>
+        <w:numPr>
+          <w:ilvl w:val="0"/>
+          <w:numId w:val="30"/>
+        </w:numPr>
+      </w:pPr>
+    </w:p>
     <w:sectPr>
       <w:headerReference w:type="even" r:id="rId48"/>
       <w:headerReference w:type="default" r:id="rId49"/>
@@ -9885,11 +10101,6 @@
         <w:docPartUnique/>
       </w:docPartObj>
     </w:sdtPr>
-    <w:sdtEndPr>
-      <w:rPr>
-        <w:rStyle w:val="PageNumber"/>
-      </w:rPr>
-    </w:sdtEndPr>
     <w:sdtContent>
       <w:p>
         <w:pPr>
@@ -9942,11 +10153,6 @@
         <w:docPartUnique/>
       </w:docPartObj>
     </w:sdtPr>
-    <w:sdtEndPr>
-      <w:rPr>
-        <w:rStyle w:val="PageNumber"/>
-      </w:rPr>
-    </w:sdtEndPr>
     <w:sdtContent>
       <w:p>
         <w:pPr>
@@ -12705,7 +12911,7 @@
         <w:rFonts w:ascii="Wingdings" w:hAnsi="Wingdings" w:hint="default"/>
       </w:rPr>
     </w:lvl>
-    <w:lvl w:ilvl="3" w:tplc="04090001" w:tentative="1">
+    <w:lvl w:ilvl="3" w:tplc="04090001">
       <w:start w:val="1"/>
       <w:numFmt w:val="bullet"/>
       <w:lvlText w:val=""/>
@@ -14377,7 +14583,6 @@
   <w:style w:type="character" w:default="1" w:styleId="DefaultParagraphFont">
     <w:name w:val="Default Paragraph Font"/>
     <w:uiPriority w:val="1"/>
-    <w:semiHidden/>
     <w:unhideWhenUsed/>
   </w:style>
   <w:style w:type="table" w:default="1" w:styleId="TableNormal">

</xml_diff>